<commit_message>
Add second classifier epoch experiment and report
</commit_message>
<xml_diff>
--- a/Submission/Task1_Product_Classifier/EYOUTH-30909090117044-Product_Classifier_Report.docx
+++ b/Submission/Task1_Product_Classifier/EYOUTH-30909090117044-Product_Classifier_Report.docx
@@ -325,6 +325,228 @@
     <w:p>
       <w:r>
         <w:t>Run evidence is included separately in EYOUTH-30909090117044-Training_Run_Output.txt.</w:t>
+      </w:r>
+    </w:p>
+    <w:p>
+      <w:r>
+        <w:br w:type="page"/>
+      </w:r>
+    </w:p>
+    <w:p>
+      <w:pPr>
+        <w:pStyle w:val="Heading1"/>
+      </w:pPr>
+      <w:r>
+        <w:t>Two-Epoch Experiment</w:t>
+      </w:r>
+    </w:p>
+    <w:p>
+      <w:r>
+        <w:t>The original simple classifier calculates category averages, so it has no repeatable epochs. To test a real second epoch, a separate small softmax experiment was run twice on the same supplied data. A fixed random seed was used so the experiment can be repeated.</w:t>
+      </w:r>
+    </w:p>
+    <w:p>
+      <w:r>
+        <w:t>Confidence increased for all three test images after epoch 2. However, the predicted categories changed and became less reliable. This shows that higher confidence does not automatically mean the classifier became more accurate.</w:t>
+      </w:r>
+    </w:p>
+    <w:tbl>
+      <w:tblPr>
+        <w:tblStyle w:val="TableGrid"/>
+        <w:tblW w:type="auto" w:w="0"/>
+        <w:jc w:val="center"/>
+        <w:tblLook w:firstColumn="1" w:firstRow="1" w:lastColumn="0" w:lastRow="0" w:noHBand="0" w:noVBand="1" w:val="04A0"/>
+      </w:tblPr>
+      <w:tblGrid>
+        <w:gridCol w:w="2160"/>
+        <w:gridCol w:w="2160"/>
+        <w:gridCol w:w="2160"/>
+        <w:gridCol w:w="2160"/>
+      </w:tblGrid>
+      <w:tr>
+        <w:tc>
+          <w:tcPr>
+            <w:tcW w:type="dxa" w:w="2160"/>
+          </w:tcPr>
+          <w:p>
+            <w:r>
+              <w:rPr>
+                <w:b/>
+              </w:rPr>
+              <w:t>Test image</w:t>
+            </w:r>
+          </w:p>
+        </w:tc>
+        <w:tc>
+          <w:tcPr>
+            <w:tcW w:type="dxa" w:w="2160"/>
+          </w:tcPr>
+          <w:p>
+            <w:r>
+              <w:rPr>
+                <w:b/>
+              </w:rPr>
+              <w:t>Epoch 1</w:t>
+            </w:r>
+          </w:p>
+        </w:tc>
+        <w:tc>
+          <w:tcPr>
+            <w:tcW w:type="dxa" w:w="2160"/>
+          </w:tcPr>
+          <w:p>
+            <w:r>
+              <w:rPr>
+                <w:b/>
+              </w:rPr>
+              <w:t>Epoch 2</w:t>
+            </w:r>
+          </w:p>
+        </w:tc>
+        <w:tc>
+          <w:tcPr>
+            <w:tcW w:type="dxa" w:w="2160"/>
+          </w:tcPr>
+          <w:p>
+            <w:r>
+              <w:rPr>
+                <w:b/>
+              </w:rPr>
+              <w:t>Confidence change</w:t>
+            </w:r>
+          </w:p>
+        </w:tc>
+      </w:tr>
+      <w:tr>
+        <w:tc>
+          <w:tcPr>
+            <w:tcW w:type="dxa" w:w="2160"/>
+          </w:tcPr>
+          <w:p>
+            <w:r>
+              <w:t>360_F_231842968_qThCnmslPbEAwhg7nuW9rAy8qRNhRli7.jpg</w:t>
+            </w:r>
+          </w:p>
+        </w:tc>
+        <w:tc>
+          <w:tcPr>
+            <w:tcW w:type="dxa" w:w="2160"/>
+          </w:tcPr>
+          <w:p>
+            <w:r>
+              <w:t>fruit — 89.32%</w:t>
+            </w:r>
+          </w:p>
+        </w:tc>
+        <w:tc>
+          <w:tcPr>
+            <w:tcW w:type="dxa" w:w="2160"/>
+          </w:tcPr>
+          <w:p>
+            <w:r>
+              <w:t>dairy — 98.18%</w:t>
+            </w:r>
+          </w:p>
+        </w:tc>
+        <w:tc>
+          <w:tcPr>
+            <w:tcW w:type="dxa" w:w="2160"/>
+          </w:tcPr>
+          <w:p>
+            <w:r>
+              <w:t>+8.86 points</w:t>
+            </w:r>
+          </w:p>
+        </w:tc>
+      </w:tr>
+      <w:tr>
+        <w:tc>
+          <w:tcPr>
+            <w:tcW w:type="dxa" w:w="2160"/>
+          </w:tcPr>
+          <w:p>
+            <w:r>
+              <w:t>Marketvegetables.jpg</w:t>
+            </w:r>
+          </w:p>
+        </w:tc>
+        <w:tc>
+          <w:tcPr>
+            <w:tcW w:type="dxa" w:w="2160"/>
+          </w:tcPr>
+          <w:p>
+            <w:r>
+              <w:t>dairy — 54.26%</w:t>
+            </w:r>
+          </w:p>
+        </w:tc>
+        <w:tc>
+          <w:tcPr>
+            <w:tcW w:type="dxa" w:w="2160"/>
+          </w:tcPr>
+          <w:p>
+            <w:r>
+              <w:t>fruit — 62.90%</w:t>
+            </w:r>
+          </w:p>
+        </w:tc>
+        <w:tc>
+          <w:tcPr>
+            <w:tcW w:type="dxa" w:w="2160"/>
+          </w:tcPr>
+          <w:p>
+            <w:r>
+              <w:t>+8.64 points</w:t>
+            </w:r>
+          </w:p>
+        </w:tc>
+      </w:tr>
+      <w:tr>
+        <w:tc>
+          <w:tcPr>
+            <w:tcW w:type="dxa" w:w="2160"/>
+          </w:tcPr>
+          <w:p>
+            <w:r>
+              <w:t>Oranges_-_whole-halved-segment.jpg</w:t>
+            </w:r>
+          </w:p>
+        </w:tc>
+        <w:tc>
+          <w:tcPr>
+            <w:tcW w:type="dxa" w:w="2160"/>
+          </w:tcPr>
+          <w:p>
+            <w:r>
+              <w:t>fruit — 58.37%</w:t>
+            </w:r>
+          </w:p>
+        </w:tc>
+        <w:tc>
+          <w:tcPr>
+            <w:tcW w:type="dxa" w:w="2160"/>
+          </w:tcPr>
+          <w:p>
+            <w:r>
+              <w:t>veg — 71.24%</w:t>
+            </w:r>
+          </w:p>
+        </w:tc>
+        <w:tc>
+          <w:tcPr>
+            <w:tcW w:type="dxa" w:w="2160"/>
+          </w:tcPr>
+          <w:p>
+            <w:r>
+              <w:t>+12.87 points</w:t>
+            </w:r>
+          </w:p>
+        </w:tc>
+      </w:tr>
+    </w:tbl>
+    <w:p>
+      <w:r>
+        <w:t>The full output from this second-epoch run is saved in EYOUTH-30909090117044-Epoch_Experiment_Output.txt.</w:t>
       </w:r>
     </w:p>
     <w:sectPr>

</xml_diff>